<commit_message>
Add retrieval evals, live smoke, and portfolio materials
</commit_message>
<xml_diff>
--- a/resumes/Leonid_Chekin_Resume_AI_RAG_ATS.docx
+++ b/resumes/Leonid_Chekin_Resume_AI_RAG_ATS.docx
@@ -308,10 +308,10 @@
         <w:rPr>
           <w:b/>
         </w:rPr>
-        <w:t xml:space="preserve">AI and Business Process Automation. </w:t>
+        <w:t xml:space="preserve">AI Engineer Portfolio | Learning project. </w:t>
       </w:r>
       <w:r>
-        <w:t>Assistant workflows for incoming data, semantic deduplication, and CRM/Telegram integrations. Stack: Python, APIs, automation workflows.</w:t>
+        <w:t>Six FastAPI demos for structured intake, document processing, cited RAG, evals, and approval-gated actions. Public mode is mock-only. Stack: PostgreSQL/pgvector, Redis/Celery, FastEmbed, Docker.</w:t>
       </w:r>
     </w:p>
     <w:sectPr>

</xml_diff>